<commit_message>
feat(pivot): Task 1 - rename and relabel demo to the client's group
Units, users, classification display names, client compartments, documents,
prompts, UI labels, tests and smoke script moved from army-HQ terms to the
EIB group. Authorization oracle unchanged (visibility sets identical).
Cache prefill intentionally not rerun.

Co-Authored-By: Claude Sonnet 5.5 <noreply@anthropic.com>
</commit_message>
<xml_diff>
--- a/data/documents/DOC-202_training_directive.docx
+++ b/data/documents/DOC-202_training_directive.docx
@@ -28,12 +28,12 @@
     </w:p>
     <w:p>
       <w:r>
-        <w:t>This directive establishes mandatory training requirements for readiness certification across Battalion 4. It applies to all personnel regardless of appointment.</w:t>
+        <w:t>This directive establishes mandatory training requirements for operational certification across Stratoc Site Team 4. It applies to all personnel regardless of appointment.</w:t>
       </w:r>
     </w:p>
     <w:p>
       <w:r>
-        <w:t>Training is a command responsibility and is delivered on the unit training programme.</w:t>
+        <w:t>Training is a management responsibility and is delivered on the site training programme.</w:t>
       </w:r>
     </w:p>
     <w:p>
@@ -51,7 +51,7 @@
     </w:p>
     <w:p>
       <w:r>
-        <w:t>Units must submit a quarterly readiness report to the training wing.</w:t>
+        <w:t>Units must submit a quarterly readiness report to Group management.</w:t>
       </w:r>
     </w:p>
     <w:sectPr>

</xml_diff>